<commit_message>
PSF: szablony 1:1 z wypelnionymi teczkami (PAK1 3-opc.+punktacja, PAK2 [1-2-3-3-3]+Europass, C1/PAK3 oswiadczenia, tokeny wiek50/isced3minus/isced_grupa)
</commit_message>
<xml_diff>
--- a/public/wzory/PSF_PAK1_Zgloszenie_potrzeb_szablon.docx
+++ b/public/wzory/PSF_PAK1_Zgloszenie_potrzeb_szablon.docx
@@ -84,6 +84,12 @@
         <w:gridCol w:w="6764"/>
       </w:tblGrid>
       <w:tr>
+        <w:tblPrEx>
+          <w:tblCellMar>
+            <w:top w:w="0" w:type="dxa"/>
+            <w:bottom w:w="0" w:type="dxa"/>
+          </w:tblCellMar>
+        </w:tblPrEx>
         <w:tc>
           <w:tcPr>
             <w:tcW w:w="0" w:type="auto"/>
@@ -123,6 +129,12 @@
         </w:tc>
       </w:tr>
       <w:tr>
+        <w:tblPrEx>
+          <w:tblCellMar>
+            <w:top w:w="0" w:type="dxa"/>
+            <w:bottom w:w="0" w:type="dxa"/>
+          </w:tblCellMar>
+        </w:tblPrEx>
         <w:tc>
           <w:tcPr>
             <w:tcW w:w="2262" w:type="dxa"/>
@@ -156,12 +168,23 @@
           </w:tcPr>
           <w:p>
             <w:r>
+              <w:rPr>
+                <w:rFonts w:ascii="Arial" w:eastAsia="Arial" w:hAnsi="Arial" w:cs="Arial"/>
+                <w:sz w:val="22"/>
+                <w:szCs w:val="22"/>
+              </w:rPr>
               <w:t>{{imie_nazwisko}}</w:t>
             </w:r>
           </w:p>
         </w:tc>
       </w:tr>
       <w:tr>
+        <w:tblPrEx>
+          <w:tblCellMar>
+            <w:top w:w="0" w:type="dxa"/>
+            <w:bottom w:w="0" w:type="dxa"/>
+          </w:tblCellMar>
+        </w:tblPrEx>
         <w:tc>
           <w:tcPr>
             <w:tcW w:w="2262" w:type="dxa"/>
@@ -195,12 +218,23 @@
           </w:tcPr>
           <w:p>
             <w:r>
+              <w:rPr>
+                <w:rFonts w:ascii="Arial" w:eastAsia="Arial" w:hAnsi="Arial" w:cs="Arial"/>
+                <w:sz w:val="22"/>
+                <w:szCs w:val="22"/>
+              </w:rPr>
               <w:t>{{pesel}}</w:t>
             </w:r>
           </w:p>
         </w:tc>
       </w:tr>
       <w:tr>
+        <w:tblPrEx>
+          <w:tblCellMar>
+            <w:top w:w="0" w:type="dxa"/>
+            <w:bottom w:w="0" w:type="dxa"/>
+          </w:tblCellMar>
+        </w:tblPrEx>
         <w:tc>
           <w:tcPr>
             <w:tcW w:w="2262" w:type="dxa"/>
@@ -245,6 +279,12 @@
         </w:tc>
       </w:tr>
       <w:tr>
+        <w:tblPrEx>
+          <w:tblCellMar>
+            <w:top w:w="0" w:type="dxa"/>
+            <w:bottom w:w="0" w:type="dxa"/>
+          </w:tblCellMar>
+        </w:tblPrEx>
         <w:tc>
           <w:tcPr>
             <w:tcW w:w="2262" w:type="dxa"/>
@@ -278,12 +318,23 @@
           </w:tcPr>
           <w:p>
             <w:r>
+              <w:rPr>
+                <w:rFonts w:ascii="Arial" w:eastAsia="Arial" w:hAnsi="Arial" w:cs="Arial"/>
+                <w:sz w:val="22"/>
+                <w:szCs w:val="22"/>
+              </w:rPr>
               <w:t>{{data_urodzenia}}</w:t>
             </w:r>
           </w:p>
         </w:tc>
       </w:tr>
       <w:tr>
+        <w:tblPrEx>
+          <w:tblCellMar>
+            <w:top w:w="0" w:type="dxa"/>
+            <w:bottom w:w="0" w:type="dxa"/>
+          </w:tblCellMar>
+        </w:tblPrEx>
         <w:tc>
           <w:tcPr>
             <w:tcW w:w="2262" w:type="dxa"/>
@@ -317,12 +368,23 @@
           </w:tcPr>
           <w:p>
             <w:r>
+              <w:rPr>
+                <w:rFonts w:ascii="Arial" w:eastAsia="Arial" w:hAnsi="Arial" w:cs="Arial"/>
+                <w:sz w:val="22"/>
+                <w:szCs w:val="22"/>
+              </w:rPr>
               <w:t>{{wiek}}</w:t>
             </w:r>
           </w:p>
         </w:tc>
       </w:tr>
       <w:tr>
+        <w:tblPrEx>
+          <w:tblCellMar>
+            <w:top w:w="0" w:type="dxa"/>
+            <w:bottom w:w="0" w:type="dxa"/>
+          </w:tblCellMar>
+        </w:tblPrEx>
         <w:tc>
           <w:tcPr>
             <w:tcW w:w="2262" w:type="dxa"/>
@@ -356,12 +418,23 @@
           </w:tcPr>
           <w:p>
             <w:r>
+              <w:rPr>
+                <w:rFonts w:ascii="Arial" w:eastAsia="Arial" w:hAnsi="Arial" w:cs="Arial"/>
+                <w:sz w:val="22"/>
+                <w:szCs w:val="22"/>
+              </w:rPr>
               <w:t>{{obywatelstwo}}</w:t>
             </w:r>
           </w:p>
         </w:tc>
       </w:tr>
       <w:tr>
+        <w:tblPrEx>
+          <w:tblCellMar>
+            <w:top w:w="0" w:type="dxa"/>
+            <w:bottom w:w="0" w:type="dxa"/>
+          </w:tblCellMar>
+        </w:tblPrEx>
         <w:tc>
           <w:tcPr>
             <w:tcW w:w="2262" w:type="dxa"/>
@@ -395,12 +468,23 @@
           </w:tcPr>
           <w:p>
             <w:r>
+              <w:rPr>
+                <w:rFonts w:ascii="Arial" w:eastAsia="Arial" w:hAnsi="Arial" w:cs="Arial"/>
+                <w:sz w:val="22"/>
+                <w:szCs w:val="22"/>
+              </w:rPr>
               <w:t>{{telefon}}</w:t>
             </w:r>
           </w:p>
         </w:tc>
       </w:tr>
       <w:tr>
+        <w:tblPrEx>
+          <w:tblCellMar>
+            <w:top w:w="0" w:type="dxa"/>
+            <w:bottom w:w="0" w:type="dxa"/>
+          </w:tblCellMar>
+        </w:tblPrEx>
         <w:tc>
           <w:tcPr>
             <w:tcW w:w="2262" w:type="dxa"/>
@@ -457,81 +541,45 @@
           <w:sz w:val="22"/>
           <w:szCs w:val="22"/>
         </w:rPr>
-        <w:t>Poziom wykształcenia (ISCED):</w:t>
-      </w:r>
-    </w:p>
-    <w:p>
-      <w:pPr>
-        <w:tabs>
-          <w:tab w:val="left" w:pos="4820"/>
-        </w:tabs>
-        <w:spacing w:after="60"/>
-      </w:pPr>
-      <w:r>
-        <w:rPr>
-          <w:rFonts w:ascii="Arial" w:eastAsia="Arial" w:hAnsi="Arial" w:cs="Arial"/>
-          <w:sz w:val="22"/>
-          <w:szCs w:val="22"/>
-        </w:rPr>
-        <w:t>{{cb_isced0}} Brak (ISCED 0)</w:t>
-      </w:r>
-      <w:r>
-        <w:rPr>
-          <w:rFonts w:ascii="Arial" w:eastAsia="Arial" w:hAnsi="Arial" w:cs="Arial"/>
-          <w:sz w:val="22"/>
-          <w:szCs w:val="22"/>
-        </w:rPr>
-        <w:tab/>
-        <w:t>{{cb_isced1}} Podstawowe (ISCED 1)</w:t>
-      </w:r>
-    </w:p>
-    <w:p>
-      <w:pPr>
-        <w:tabs>
-          <w:tab w:val="left" w:pos="4820"/>
-        </w:tabs>
-        <w:spacing w:after="60"/>
-      </w:pPr>
-      <w:r>
-        <w:rPr>
-          <w:rFonts w:ascii="Arial" w:eastAsia="Arial" w:hAnsi="Arial" w:cs="Arial"/>
-          <w:sz w:val="22"/>
-          <w:szCs w:val="22"/>
-        </w:rPr>
-        <w:t>{{cb_isced2}} Gimnazjalne (ISCED 2)</w:t>
-      </w:r>
-      <w:r>
-        <w:rPr>
-          <w:rFonts w:ascii="Arial" w:eastAsia="Arial" w:hAnsi="Arial" w:cs="Arial"/>
-          <w:sz w:val="22"/>
-          <w:szCs w:val="22"/>
-        </w:rPr>
-        <w:tab/>
-        <w:t>{{cb_isced3}} Pogimnazjalne / zawodowe (ISCED 3)</w:t>
-      </w:r>
-    </w:p>
-    <w:p>
-      <w:pPr>
-        <w:tabs>
-          <w:tab w:val="left" w:pos="4820"/>
-        </w:tabs>
-        <w:spacing w:after="60"/>
-      </w:pPr>
-      <w:r>
-        <w:rPr>
-          <w:rFonts w:ascii="Arial" w:eastAsia="Arial" w:hAnsi="Arial" w:cs="Arial"/>
-          <w:sz w:val="22"/>
-          <w:szCs w:val="22"/>
-        </w:rPr>
-        <w:t>{{cb_isced4}} Policealne (ISCED 4)</w:t>
-      </w:r>
-      <w:r>
-        <w:rPr>
-          <w:rFonts w:ascii="Arial" w:eastAsia="Arial" w:hAnsi="Arial" w:cs="Arial"/>
-          <w:sz w:val="22"/>
-          <w:szCs w:val="22"/>
-        </w:rPr>
-        <w:tab/>
+        <w:t>Najwyższy ukończony poziom wykształcenia:</w:t>
+      </w:r>
+    </w:p>
+    <w:p>
+      <w:pPr>
+        <w:spacing w:after="100"/>
+      </w:pPr>
+      <w:r>
+        <w:rPr>
+          <w:rFonts w:ascii="Arial" w:eastAsia="Arial" w:hAnsi="Arial" w:cs="Arial"/>
+          <w:sz w:val="22"/>
+          <w:szCs w:val="22"/>
+        </w:rPr>
+        <w:t>{{cb_isced02}} Średnie I stopnia lub niższe (ISCED 0-2)</w:t>
+      </w:r>
+    </w:p>
+    <w:p>
+      <w:pPr>
+        <w:spacing w:after="100"/>
+      </w:pPr>
+      <w:r>
+        <w:rPr>
+          <w:rFonts w:ascii="Arial" w:eastAsia="Arial" w:hAnsi="Arial" w:cs="Arial"/>
+          <w:sz w:val="22"/>
+          <w:szCs w:val="22"/>
+        </w:rPr>
+        <w:t>{{cb_isced34}} Ponadgimnazjalne lub policealne (ISCED 3-4)</w:t>
+      </w:r>
+    </w:p>
+    <w:p>
+      <w:pPr>
+        <w:spacing w:after="100"/>
+      </w:pPr>
+      <w:r>
+        <w:rPr>
+          <w:rFonts w:ascii="Arial" w:eastAsia="Arial" w:hAnsi="Arial" w:cs="Arial"/>
+          <w:sz w:val="22"/>
+          <w:szCs w:val="22"/>
+        </w:rPr>
         <w:t>{{cb_isced58}} Wyższe (ISCED 5-8)</w:t>
       </w:r>
     </w:p>
@@ -572,6 +620,12 @@
         <w:gridCol w:w="6764"/>
       </w:tblGrid>
       <w:tr>
+        <w:tblPrEx>
+          <w:tblCellMar>
+            <w:top w:w="0" w:type="dxa"/>
+            <w:bottom w:w="0" w:type="dxa"/>
+          </w:tblCellMar>
+        </w:tblPrEx>
         <w:tc>
           <w:tcPr>
             <w:tcW w:w="0" w:type="auto"/>
@@ -611,6 +665,12 @@
         </w:tc>
       </w:tr>
       <w:tr>
+        <w:tblPrEx>
+          <w:tblCellMar>
+            <w:top w:w="0" w:type="dxa"/>
+            <w:bottom w:w="0" w:type="dxa"/>
+          </w:tblCellMar>
+        </w:tblPrEx>
         <w:tc>
           <w:tcPr>
             <w:tcW w:w="2262" w:type="dxa"/>
@@ -654,6 +714,12 @@
         </w:tc>
       </w:tr>
       <w:tr>
+        <w:tblPrEx>
+          <w:tblCellMar>
+            <w:top w:w="0" w:type="dxa"/>
+            <w:bottom w:w="0" w:type="dxa"/>
+          </w:tblCellMar>
+        </w:tblPrEx>
         <w:tc>
           <w:tcPr>
             <w:tcW w:w="2262" w:type="dxa"/>
@@ -697,6 +763,12 @@
         </w:tc>
       </w:tr>
       <w:tr>
+        <w:tblPrEx>
+          <w:tblCellMar>
+            <w:top w:w="0" w:type="dxa"/>
+            <w:bottom w:w="0" w:type="dxa"/>
+          </w:tblCellMar>
+        </w:tblPrEx>
         <w:tc>
           <w:tcPr>
             <w:tcW w:w="2262" w:type="dxa"/>
@@ -730,12 +802,23 @@
           </w:tcPr>
           <w:p>
             <w:r>
+              <w:rPr>
+                <w:rFonts w:ascii="Arial" w:eastAsia="Arial" w:hAnsi="Arial" w:cs="Arial"/>
+                <w:sz w:val="22"/>
+                <w:szCs w:val="22"/>
+              </w:rPr>
               <w:t>{{powiat}}</w:t>
             </w:r>
           </w:p>
         </w:tc>
       </w:tr>
       <w:tr>
+        <w:tblPrEx>
+          <w:tblCellMar>
+            <w:top w:w="0" w:type="dxa"/>
+            <w:bottom w:w="0" w:type="dxa"/>
+          </w:tblCellMar>
+        </w:tblPrEx>
         <w:tc>
           <w:tcPr>
             <w:tcW w:w="2262" w:type="dxa"/>
@@ -769,12 +852,23 @@
           </w:tcPr>
           <w:p>
             <w:r>
+              <w:rPr>
+                <w:rFonts w:ascii="Arial" w:eastAsia="Arial" w:hAnsi="Arial" w:cs="Arial"/>
+                <w:sz w:val="22"/>
+                <w:szCs w:val="22"/>
+              </w:rPr>
               <w:t>{{gmina}}</w:t>
             </w:r>
           </w:p>
         </w:tc>
       </w:tr>
       <w:tr>
+        <w:tblPrEx>
+          <w:tblCellMar>
+            <w:top w:w="0" w:type="dxa"/>
+            <w:bottom w:w="0" w:type="dxa"/>
+          </w:tblCellMar>
+        </w:tblPrEx>
         <w:tc>
           <w:tcPr>
             <w:tcW w:w="2262" w:type="dxa"/>
@@ -808,12 +902,23 @@
           </w:tcPr>
           <w:p>
             <w:r>
+              <w:rPr>
+                <w:rFonts w:ascii="Arial" w:eastAsia="Arial" w:hAnsi="Arial" w:cs="Arial"/>
+                <w:sz w:val="22"/>
+                <w:szCs w:val="22"/>
+              </w:rPr>
               <w:t>{{miejscowosc}}</w:t>
             </w:r>
           </w:p>
         </w:tc>
       </w:tr>
       <w:tr>
+        <w:tblPrEx>
+          <w:tblCellMar>
+            <w:top w:w="0" w:type="dxa"/>
+            <w:bottom w:w="0" w:type="dxa"/>
+          </w:tblCellMar>
+        </w:tblPrEx>
         <w:tc>
           <w:tcPr>
             <w:tcW w:w="2262" w:type="dxa"/>
@@ -853,6 +958,12 @@
         </w:tc>
       </w:tr>
       <w:tr>
+        <w:tblPrEx>
+          <w:tblCellMar>
+            <w:top w:w="0" w:type="dxa"/>
+            <w:bottom w:w="0" w:type="dxa"/>
+          </w:tblCellMar>
+        </w:tblPrEx>
         <w:tc>
           <w:tcPr>
             <w:tcW w:w="2262" w:type="dxa"/>
@@ -886,12 +997,23 @@
           </w:tcPr>
           <w:p>
             <w:r>
+              <w:rPr>
+                <w:rFonts w:ascii="Arial" w:eastAsia="Arial" w:hAnsi="Arial" w:cs="Arial"/>
+                <w:sz w:val="22"/>
+                <w:szCs w:val="22"/>
+              </w:rPr>
               <w:t>{{kod_pocztowy}}</w:t>
             </w:r>
           </w:p>
         </w:tc>
       </w:tr>
       <w:tr>
+        <w:tblPrEx>
+          <w:tblCellMar>
+            <w:top w:w="0" w:type="dxa"/>
+            <w:bottom w:w="0" w:type="dxa"/>
+          </w:tblCellMar>
+        </w:tblPrEx>
         <w:tc>
           <w:tcPr>
             <w:tcW w:w="2262" w:type="dxa"/>
@@ -1028,8 +1150,47 @@
           <w:sz w:val="22"/>
           <w:szCs w:val="22"/>
         </w:rPr>
+        <w:t>☐ Osoba obcego pochodzenia</w:t>
+      </w:r>
+    </w:p>
+    <w:p>
+      <w:pPr>
+        <w:spacing w:after="100"/>
+      </w:pPr>
+      <w:r>
+        <w:rPr>
+          <w:rFonts w:ascii="Arial" w:eastAsia="Arial" w:hAnsi="Arial" w:cs="Arial"/>
+          <w:sz w:val="22"/>
+          <w:szCs w:val="22"/>
+        </w:rPr>
+        <w:t>☐ Obywatel państwa trzeciego</w:t>
+      </w:r>
+    </w:p>
+    <w:p>
+      <w:pPr>
+        <w:spacing w:after="100"/>
+      </w:pPr>
+      <w:r>
+        <w:rPr>
+          <w:rFonts w:ascii="Arial" w:eastAsia="Arial" w:hAnsi="Arial" w:cs="Arial"/>
+          <w:sz w:val="22"/>
+          <w:szCs w:val="22"/>
+        </w:rPr>
+        <w:t>☐ Osoba należąca do mniejszości narodowej lub etnicznej</w:t>
+      </w:r>
+    </w:p>
+    <w:p>
+      <w:pPr>
+        <w:spacing w:after="100"/>
+      </w:pPr>
+      <w:r>
+        <w:rPr>
+          <w:rFonts w:ascii="Arial" w:eastAsia="Arial" w:hAnsi="Arial" w:cs="Arial"/>
+          <w:sz w:val="22"/>
+          <w:szCs w:val="22"/>
+        </w:rPr>
         <w:lastRenderedPageBreak/>
-        <w:t>☐ Osoba obcego pochodzenia</w:t>
+        <w:t>☐ Osoba bezdomna lub dotknięta wykluczeniem z dostępu do mieszkań</w:t>
       </w:r>
     </w:p>
     <w:p>
@@ -1042,7 +1203,7 @@
           <w:sz w:val="22"/>
           <w:szCs w:val="22"/>
         </w:rPr>
-        <w:t>☐ Obywatel państwa trzeciego</w:t>
+        <w:t>☐ Osoba z niepełnosprawnościami</w:t>
       </w:r>
     </w:p>
     <w:p>
@@ -1055,46 +1216,7 @@
           <w:sz w:val="22"/>
           <w:szCs w:val="22"/>
         </w:rPr>
-        <w:t>☐ Osoba należąca do mniejszości narodowej lub etnicznej</w:t>
-      </w:r>
-    </w:p>
-    <w:p>
-      <w:pPr>
-        <w:spacing w:after="100"/>
-      </w:pPr>
-      <w:r>
-        <w:rPr>
-          <w:rFonts w:ascii="Arial" w:eastAsia="Arial" w:hAnsi="Arial" w:cs="Arial"/>
-          <w:sz w:val="22"/>
-          <w:szCs w:val="22"/>
-        </w:rPr>
-        <w:t>☐ Osoba bezdomna lub dotknięta wykluczeniem z dostępu do mieszkań</w:t>
-      </w:r>
-    </w:p>
-    <w:p>
-      <w:pPr>
-        <w:spacing w:after="100"/>
-      </w:pPr>
-      <w:r>
-        <w:rPr>
-          <w:rFonts w:ascii="Arial" w:eastAsia="Arial" w:hAnsi="Arial" w:cs="Arial"/>
-          <w:sz w:val="22"/>
-          <w:szCs w:val="22"/>
-        </w:rPr>
-        <w:t>☐ Osoba z niepełnosprawnościami</w:t>
-      </w:r>
-    </w:p>
-    <w:p>
-      <w:pPr>
-        <w:spacing w:after="100"/>
-      </w:pPr>
-      <w:r>
-        <w:rPr>
-          <w:rFonts w:ascii="Arial" w:eastAsia="Arial" w:hAnsi="Arial" w:cs="Arial"/>
-          <w:sz w:val="22"/>
-          <w:szCs w:val="22"/>
-        </w:rPr>
-        <w:t>☐ Nie dotyczy żadnego z powyższych</w:t>
+        <w:t>☒ Nie dotyczy żadnego z powyższych</w:t>
       </w:r>
     </w:p>
     <w:p>
@@ -1137,7 +1259,7 @@
           <w:sz w:val="22"/>
           <w:szCs w:val="22"/>
         </w:rPr>
-        <w:t>☐ Kompetencje cyfrowe</w:t>
+        <w:t>☒ Kompetencje cyfrowe</w:t>
       </w:r>
     </w:p>
     <w:p>
@@ -1163,7 +1285,7 @@
           <w:sz w:val="22"/>
           <w:szCs w:val="22"/>
         </w:rPr>
-        <w:t>☐ Kompetencje społeczne</w:t>
+        <w:t>☒ Kompetencje społeczne</w:t>
       </w:r>
     </w:p>
     <w:p>
@@ -1176,7 +1298,7 @@
           <w:sz w:val="22"/>
           <w:szCs w:val="22"/>
         </w:rPr>
-        <w:t>☐ Kompetencje zawodowe</w:t>
+        <w:t>☒ Kompetencje zawodowe</w:t>
       </w:r>
     </w:p>
     <w:p>
@@ -1189,7 +1311,7 @@
           <w:sz w:val="22"/>
           <w:szCs w:val="22"/>
         </w:rPr>
-        <w:t>☐ Zielone kompetencje</w:t>
+        <w:t>☒ Zielone kompetencje</w:t>
       </w:r>
     </w:p>
     <w:p>
@@ -1207,7 +1329,7 @@
           <w:sz w:val="22"/>
           <w:szCs w:val="22"/>
         </w:rPr>
-        <w:t>Czy korzystał/a z usług doradztwa (BUR)?  ☐ TAK   ☐ NIE</w:t>
+        <w:t>Czy korzystał/a z usług doradztwa (BUR)?  ☒ TAK   ☐ NIE</w:t>
       </w:r>
     </w:p>
     <w:p>
@@ -1220,7 +1342,7 @@
           <w:sz w:val="22"/>
           <w:szCs w:val="22"/>
         </w:rPr>
-        <w:t>Czy posiada konto BUR?  ☐ TAK   ☐ NIE</w:t>
+        <w:t>Czy posiada konto BUR?  ☒ TAK   ☐ NIE</w:t>
       </w:r>
     </w:p>
     <w:p>
@@ -1248,7 +1370,7 @@
           <w:sz w:val="22"/>
           <w:szCs w:val="22"/>
         </w:rPr>
-        <w:t>☐ Kobieta (ograniczony dostęp do edukacji, stereotypy) – 20 pkt</w:t>
+        <w:t>{{cb_kobieta}} Kobieta (ograniczony dostęp do edukacji, stereotypy) – 20 pkt</w:t>
       </w:r>
     </w:p>
     <w:p>
@@ -1274,7 +1396,7 @@
           <w:sz w:val="22"/>
           <w:szCs w:val="22"/>
         </w:rPr>
-        <w:t>☐ Osoba w wieku 50 lat i powyżej – 20 pkt</w:t>
+        <w:t>{{cb_wiek50}} Osoba w wieku 50 lat i powyżej – 20 pkt</w:t>
       </w:r>
     </w:p>
     <w:p>
@@ -1287,7 +1409,7 @@
           <w:sz w:val="22"/>
           <w:szCs w:val="22"/>
         </w:rPr>
-        <w:t>☐ Osoba z wykształceniem ISCED 3 lub niższym – 20 pkt</w:t>
+        <w:t>{{cb_isced3minus}} Osoba z wykształceniem ISCED 3 lub niższym – 20 pkt</w:t>
       </w:r>
     </w:p>
     <w:p>
@@ -1300,7 +1422,7 @@
           <w:sz w:val="22"/>
           <w:szCs w:val="22"/>
         </w:rPr>
-        <w:t>☐ Mieszkaniec/ka obszaru wiejskiego DEGURBA 3 – 20 pkt</w:t>
+        <w:t>{{cb_degurba_wiejski}} Mieszkaniec/ka obszaru wiejskiego DEGURBA 3 – 20 pkt</w:t>
       </w:r>
     </w:p>
     <w:p>
@@ -1333,7 +1455,7 @@
           <w:sz w:val="22"/>
           <w:szCs w:val="22"/>
         </w:rPr>
-        <w:t>SUMA PUNKTÓW PREMIUJĄCYCH: _________  /  SUMA OGÓŁEM (merytoryczne + premiujące): _________</w:t>
+        <w:t>SUMA PUNKTÓW PREMIUJĄCYCH: 50  /  SUMA OGÓŁEM (merytoryczne + premiujące): 80</w:t>
       </w:r>
     </w:p>
     <w:p>
@@ -1439,7 +1561,6 @@
           <w:sz w:val="22"/>
           <w:szCs w:val="22"/>
         </w:rPr>
-        <w:lastRenderedPageBreak/>
         <w:t>6. Oświadczam, że nie wykorzystałem/am limitu dofinansowania usług rozwojowych w kwocie 4 500 PLN w ramach Działania FELB.06.08.</w:t>
       </w:r>
     </w:p>
@@ -1471,7 +1592,6 @@
     </w:p>
     <w:p>
       <w:pPr>
-        <w:pageBreakBefore/>
         <w:spacing w:before="200" w:after="120"/>
       </w:pPr>
       <w:r>
@@ -1493,6 +1613,7 @@
         <w:rPr>
           <w:rFonts w:ascii="Arial" w:eastAsia="Arial" w:hAnsi="Arial" w:cs="Arial"/>
         </w:rPr>
+        <w:lastRenderedPageBreak/>
         <w:t>☒ Zapoznałem/am się z klauzulą informacyjną RODO (Załącznik do Umowy wsparcia).</w:t>
       </w:r>
     </w:p>
@@ -1566,6 +1687,12 @@
         <w:gridCol w:w="6164"/>
       </w:tblGrid>
       <w:tr>
+        <w:tblPrEx>
+          <w:tblCellMar>
+            <w:top w:w="0" w:type="dxa"/>
+            <w:bottom w:w="0" w:type="dxa"/>
+          </w:tblCellMar>
+        </w:tblPrEx>
         <w:tc>
           <w:tcPr>
             <w:tcW w:w="0" w:type="auto"/>
@@ -1605,6 +1732,12 @@
         </w:tc>
       </w:tr>
       <w:tr>
+        <w:tblPrEx>
+          <w:tblCellMar>
+            <w:top w:w="0" w:type="dxa"/>
+            <w:bottom w:w="0" w:type="dxa"/>
+          </w:tblCellMar>
+        </w:tblPrEx>
         <w:tc>
           <w:tcPr>
             <w:tcW w:w="2262" w:type="dxa"/>
@@ -1643,12 +1776,18 @@
                 <w:sz w:val="22"/>
                 <w:szCs w:val="22"/>
               </w:rPr>
-              <w:t>_____/_____/_________</w:t>
+              <w:t>{{data_dzis}}</w:t>
             </w:r>
           </w:p>
         </w:tc>
       </w:tr>
       <w:tr>
+        <w:tblPrEx>
+          <w:tblCellMar>
+            <w:top w:w="0" w:type="dxa"/>
+            <w:bottom w:w="0" w:type="dxa"/>
+          </w:tblCellMar>
+        </w:tblPrEx>
         <w:tc>
           <w:tcPr>
             <w:tcW w:w="2262" w:type="dxa"/>
@@ -1693,6 +1832,12 @@
         </w:tc>
       </w:tr>
       <w:tr>
+        <w:tblPrEx>
+          <w:tblCellMar>
+            <w:top w:w="0" w:type="dxa"/>
+            <w:bottom w:w="0" w:type="dxa"/>
+          </w:tblCellMar>
+        </w:tblPrEx>
         <w:tc>
           <w:tcPr>
             <w:tcW w:w="0" w:type="auto"/>
@@ -1732,6 +1877,12 @@
         </w:tc>
       </w:tr>
       <w:tr>
+        <w:tblPrEx>
+          <w:tblCellMar>
+            <w:top w:w="0" w:type="dxa"/>
+            <w:bottom w:w="0" w:type="dxa"/>
+          </w:tblCellMar>
+        </w:tblPrEx>
         <w:tc>
           <w:tcPr>
             <w:tcW w:w="2262" w:type="dxa"/>
@@ -1770,12 +1921,18 @@
                 <w:sz w:val="22"/>
                 <w:szCs w:val="22"/>
               </w:rPr>
-              <w:t>_____/_____/_________</w:t>
+              <w:t>{{data_dzis}}</w:t>
             </w:r>
           </w:p>
         </w:tc>
       </w:tr>
       <w:tr>
+        <w:tblPrEx>
+          <w:tblCellMar>
+            <w:top w:w="0" w:type="dxa"/>
+            <w:bottom w:w="0" w:type="dxa"/>
+          </w:tblCellMar>
+        </w:tblPrEx>
         <w:tc>
           <w:tcPr>
             <w:tcW w:w="2262" w:type="dxa"/>
@@ -1814,12 +1971,18 @@
                 <w:sz w:val="22"/>
                 <w:szCs w:val="22"/>
               </w:rPr>
-              <w:t>☐ Pozytywny   ☐ Negatywny</w:t>
+              <w:t>☒ Pozytywny   ☐ Negatywny</w:t>
             </w:r>
           </w:p>
         </w:tc>
       </w:tr>
       <w:tr>
+        <w:tblPrEx>
+          <w:tblCellMar>
+            <w:top w:w="0" w:type="dxa"/>
+            <w:bottom w:w="0" w:type="dxa"/>
+          </w:tblCellMar>
+        </w:tblPrEx>
         <w:tc>
           <w:tcPr>
             <w:tcW w:w="2262" w:type="dxa"/>
@@ -1864,6 +2027,12 @@
         </w:tc>
       </w:tr>
       <w:tr>
+        <w:tblPrEx>
+          <w:tblCellMar>
+            <w:top w:w="0" w:type="dxa"/>
+            <w:bottom w:w="0" w:type="dxa"/>
+          </w:tblCellMar>
+        </w:tblPrEx>
         <w:tc>
           <w:tcPr>
             <w:tcW w:w="2262" w:type="dxa"/>
@@ -1903,9 +2072,9 @@
     <w:sectPr>
       <w:headerReference w:type="even" r:id="rId7"/>
       <w:headerReference w:type="default" r:id="rId8"/>
-      <w:footerReference w:type="even" r:id="rId9"/>
-      <w:footerReference w:type="default" r:id="rId10"/>
-      <w:headerReference w:type="first" r:id="rId11"/>
+      <w:footerReference w:type="even" r:id="rId10"/>
+      <w:footerReference w:type="default" r:id="rId11"/>
+      <w:headerReference w:type="first" r:id="rId9"/>
       <w:footerReference w:type="first" r:id="rId12"/>
       <w:pgSz w:w="11906" w:h="16838"/>
       <w:pgMar w:top="1440" w:right="1440" w:bottom="1440" w:left="1440" w:header="708" w:footer="708" w:gutter="0"/>
@@ -1914,25 +2083,6 @@
     </w:sectPr>
   </w:body>
 </w:document>
-</file>
-
-<file path=word/endnotes.xml><?xml version="1.0" encoding="utf-8"?>
-<w:endnotes xmlns:wpc="http://schemas.microsoft.com/office/word/2010/wordprocessingCanvas" xmlns:cx="http://schemas.microsoft.com/office/drawing/2014/chartex" xmlns:cx1="http://schemas.microsoft.com/office/drawing/2015/9/8/chartex" xmlns:cx2="http://schemas.microsoft.com/office/drawing/2015/10/21/chartex" xmlns:cx3="http://schemas.microsoft.com/office/drawing/2016/5/9/chartex" xmlns:cx4="http://schemas.microsoft.com/office/drawing/2016/5/10/chartex" xmlns:cx5="http://schemas.microsoft.com/office/drawing/2016/5/11/chartex" xmlns:cx6="http://schemas.microsoft.com/office/drawing/2016/5/12/chartex" xmlns:cx7="http://schemas.microsoft.com/office/drawing/2016/5/13/chartex" xmlns:cx8="http://schemas.microsoft.com/office/drawing/2016/5/14/chartex" xmlns:mc="http://schemas.openxmlformats.org/markup-compatibility/2006" xmlns:aink="http://schemas.microsoft.com/office/drawing/2016/ink" xmlns:am3d="http://schemas.microsoft.com/office/drawing/2017/model3d" xmlns:o="urn:schemas-microsoft-com:office:office" xmlns:oel="http://schemas.microsoft.com/office/2019/extlst" xmlns:r="http://schemas.openxmlformats.org/officeDocument/2006/relationships" xmlns:m="http://schemas.openxmlformats.org/officeDocument/2006/math" xmlns:v="urn:schemas-microsoft-com:vml" xmlns:wp14="http://schemas.microsoft.com/office/word/2010/wordprocessingDrawing" xmlns:wp="http://schemas.openxmlformats.org/drawingml/2006/wordprocessingDrawing" xmlns:w10="urn:schemas-microsoft-com:office:word" xmlns:w="http://schemas.openxmlformats.org/wordprocessingml/2006/main" xmlns:w14="http://schemas.microsoft.com/office/word/2010/wordml" xmlns:w15="http://schemas.microsoft.com/office/word/2012/wordml" xmlns:w16cex="http://schemas.microsoft.com/office/word/2018/wordml/cex" xmlns:w16cid="http://schemas.microsoft.com/office/word/2016/wordml/cid" xmlns:w16="http://schemas.microsoft.com/office/word/2018/wordml" xmlns:w16du="http://schemas.microsoft.com/office/word/2023/wordml/word16du" xmlns:w16sdtdh="http://schemas.microsoft.com/office/word/2020/wordml/sdtdatahash" xmlns:w16sdtfl="http://schemas.microsoft.com/office/word/2024/wordml/sdtformatlock" xmlns:w16se="http://schemas.microsoft.com/office/word/2015/wordml/symex" xmlns:wpg="http://schemas.microsoft.com/office/word/2010/wordprocessingGroup" xmlns:wpi="http://schemas.microsoft.com/office/word/2010/wordprocessingInk" xmlns:wne="http://schemas.microsoft.com/office/word/2006/wordml" xmlns:wps="http://schemas.microsoft.com/office/word/2010/wordprocessingShape" mc:Ignorable="w14 w15 w16se w16cid w16 w16cex w16sdtdh w16sdtfl w16du wp14">
-  <w:endnote w:type="separator" w:id="-1">
-    <w:p>
-      <w:r>
-        <w:separator/>
-      </w:r>
-    </w:p>
-  </w:endnote>
-  <w:endnote w:type="continuationSeparator" w:id="0">
-    <w:p>
-      <w:r>
-        <w:continuationSeparator/>
-      </w:r>
-    </w:p>
-  </w:endnote>
-</w:endnotes>
 </file>
 
 <file path=word/footer1.xml><?xml version="1.0" encoding="utf-8"?>
@@ -2178,25 +2328,6 @@
     </w:pPr>
   </w:p>
 </w:ftr>
-</file>
-
-<file path=word/footnotes.xml><?xml version="1.0" encoding="utf-8"?>
-<w:footnotes xmlns:wpc="http://schemas.microsoft.com/office/word/2010/wordprocessingCanvas" xmlns:cx="http://schemas.microsoft.com/office/drawing/2014/chartex" xmlns:cx1="http://schemas.microsoft.com/office/drawing/2015/9/8/chartex" xmlns:cx2="http://schemas.microsoft.com/office/drawing/2015/10/21/chartex" xmlns:cx3="http://schemas.microsoft.com/office/drawing/2016/5/9/chartex" xmlns:cx4="http://schemas.microsoft.com/office/drawing/2016/5/10/chartex" xmlns:cx5="http://schemas.microsoft.com/office/drawing/2016/5/11/chartex" xmlns:cx6="http://schemas.microsoft.com/office/drawing/2016/5/12/chartex" xmlns:cx7="http://schemas.microsoft.com/office/drawing/2016/5/13/chartex" xmlns:cx8="http://schemas.microsoft.com/office/drawing/2016/5/14/chartex" xmlns:mc="http://schemas.openxmlformats.org/markup-compatibility/2006" xmlns:aink="http://schemas.microsoft.com/office/drawing/2016/ink" xmlns:am3d="http://schemas.microsoft.com/office/drawing/2017/model3d" xmlns:o="urn:schemas-microsoft-com:office:office" xmlns:oel="http://schemas.microsoft.com/office/2019/extlst" xmlns:r="http://schemas.openxmlformats.org/officeDocument/2006/relationships" xmlns:m="http://schemas.openxmlformats.org/officeDocument/2006/math" xmlns:v="urn:schemas-microsoft-com:vml" xmlns:wp14="http://schemas.microsoft.com/office/word/2010/wordprocessingDrawing" xmlns:wp="http://schemas.openxmlformats.org/drawingml/2006/wordprocessingDrawing" xmlns:w10="urn:schemas-microsoft-com:office:word" xmlns:w="http://schemas.openxmlformats.org/wordprocessingml/2006/main" xmlns:w14="http://schemas.microsoft.com/office/word/2010/wordml" xmlns:w15="http://schemas.microsoft.com/office/word/2012/wordml" xmlns:w16cex="http://schemas.microsoft.com/office/word/2018/wordml/cex" xmlns:w16cid="http://schemas.microsoft.com/office/word/2016/wordml/cid" xmlns:w16="http://schemas.microsoft.com/office/word/2018/wordml" xmlns:w16du="http://schemas.microsoft.com/office/word/2023/wordml/word16du" xmlns:w16sdtdh="http://schemas.microsoft.com/office/word/2020/wordml/sdtdatahash" xmlns:w16sdtfl="http://schemas.microsoft.com/office/word/2024/wordml/sdtformatlock" xmlns:w16se="http://schemas.microsoft.com/office/word/2015/wordml/symex" xmlns:wpg="http://schemas.microsoft.com/office/word/2010/wordprocessingGroup" xmlns:wpi="http://schemas.microsoft.com/office/word/2010/wordprocessingInk" xmlns:wne="http://schemas.microsoft.com/office/word/2006/wordml" xmlns:wps="http://schemas.microsoft.com/office/word/2010/wordprocessingShape" mc:Ignorable="w14 w15 w16se w16cid w16 w16cex w16sdtdh w16sdtfl w16du wp14">
-  <w:footnote w:type="separator" w:id="-1">
-    <w:p>
-      <w:r>
-        <w:separator/>
-      </w:r>
-    </w:p>
-  </w:footnote>
-  <w:footnote w:type="continuationSeparator" w:id="0">
-    <w:p>
-      <w:r>
-        <w:continuationSeparator/>
-      </w:r>
-    </w:p>
-  </w:footnote>
-</w:footnotes>
 </file>
 
 <file path=word/header1.xml><?xml version="1.0" encoding="utf-8"?>
@@ -2978,7 +3109,19 @@
     <w:link w:val="NagwekZnak"/>
     <w:uiPriority w:val="99"/>
     <w:unhideWhenUsed/>
-    <w:rsid w:val="002E0131"/>
+    <w:pPr>
+      <w:tabs>
+        <w:tab w:val="center" w:pos="4536"/>
+        <w:tab w:val="right" w:pos="9072"/>
+      </w:tabs>
+    </w:pPr>
+  </w:style>
+  <w:style w:type="paragraph" w:styleId="Stopka">
+    <w:name w:val="footer"/>
+    <w:basedOn w:val="Normalny"/>
+    <w:link w:val="StopkaZnak"/>
+    <w:uiPriority w:val="99"/>
+    <w:unhideWhenUsed/>
     <w:pPr>
       <w:tabs>
         <w:tab w:val="center" w:pos="4536"/>
@@ -2991,28 +3134,12 @@
     <w:basedOn w:val="Domylnaczcionkaakapitu"/>
     <w:link w:val="Nagwek"/>
     <w:uiPriority w:val="99"/>
-    <w:rsid w:val="002E0131"/>
-  </w:style>
-  <w:style w:type="paragraph" w:styleId="Stopka">
-    <w:name w:val="footer"/>
-    <w:basedOn w:val="Normalny"/>
-    <w:link w:val="StopkaZnak"/>
-    <w:uiPriority w:val="99"/>
-    <w:unhideWhenUsed/>
-    <w:rsid w:val="002E0131"/>
-    <w:pPr>
-      <w:tabs>
-        <w:tab w:val="center" w:pos="4536"/>
-        <w:tab w:val="right" w:pos="9072"/>
-      </w:tabs>
-    </w:pPr>
   </w:style>
   <w:style w:type="character" w:customStyle="1" w:styleId="StopkaZnak">
     <w:name w:val="Stopka Znak"/>
     <w:basedOn w:val="Domylnaczcionkaakapitu"/>
     <w:link w:val="Stopka"/>
     <w:uiPriority w:val="99"/>
-    <w:rsid w:val="002E0131"/>
   </w:style>
   <w:style w:type="paragraph" w:styleId="NormalnyWeb">
     <w:name w:val="Normal (Web)"/>
@@ -3020,7 +3147,6 @@
     <w:uiPriority w:val="99"/>
     <w:semiHidden/>
     <w:unhideWhenUsed/>
-    <w:rsid w:val="006E5FA3"/>
     <w:pPr>
       <w:spacing w:before="100" w:beforeAutospacing="1" w:after="100" w:afterAutospacing="1"/>
     </w:pPr>

</xml_diff>